<commit_message>
remove portfolio folder and change the hyperlink at websitewhich affact, fix bugs in portfolio
</commit_message>
<xml_diff>
--- a/Assets/Portfolio/GohPeiJia/Pei_Jia_Goh_CV.docx
+++ b/Assets/Portfolio/GohPeiJia/Pei_Jia_Goh_CV.docx
@@ -1,6 +1,6 @@
 
 <file path=word/document.xml><?xml version="1.0" encoding="utf-8"?>
-<w:document xmlns:wpc="http://schemas.microsoft.com/office/word/2010/wordprocessingCanvas" xmlns:cx="http://schemas.microsoft.com/office/drawing/2014/chartex" xmlns:cx1="http://schemas.microsoft.com/office/drawing/2015/9/8/chartex" xmlns:cx2="http://schemas.microsoft.com/office/drawing/2015/10/21/chartex" xmlns:cx3="http://schemas.microsoft.com/office/drawing/2016/5/9/chartex" xmlns:cx4="http://schemas.microsoft.com/office/drawing/2016/5/10/chartex" xmlns:cx5="http://schemas.microsoft.com/office/drawing/2016/5/11/chartex" xmlns:cx6="http://schemas.microsoft.com/office/drawing/2016/5/12/chartex" xmlns:cx7="http://schemas.microsoft.com/office/drawing/2016/5/13/chartex" xmlns:cx8="http://schemas.microsoft.com/office/drawing/2016/5/14/chartex" xmlns:mc="http://schemas.openxmlformats.org/markup-compatibility/2006" xmlns:aink="http://schemas.microsoft.com/office/drawing/2016/ink" xmlns:am3d="http://schemas.microsoft.com/office/drawing/2017/model3d" xmlns:o="urn:schemas-microsoft-com:office:office" xmlns:oel="http://schemas.microsoft.com/office/2019/extlst" xmlns:r="http://schemas.openxmlformats.org/officeDocument/2006/relationships" xmlns:m="http://schemas.openxmlformats.org/officeDocument/2006/math" xmlns:v="urn:schemas-microsoft-com:vml" xmlns:wp14="http://schemas.microsoft.com/office/word/2010/wordprocessingDrawing" xmlns:wp="http://schemas.openxmlformats.org/drawingml/2006/wordprocessingDrawing" xmlns:w10="urn:schemas-microsoft-com:office:word" xmlns:w="http://schemas.openxmlformats.org/wordprocessingml/2006/main" xmlns:w14="http://schemas.microsoft.com/office/word/2010/wordml" xmlns:w15="http://schemas.microsoft.com/office/word/2012/wordml" xmlns:w16cex="http://schemas.microsoft.com/office/word/2018/wordml/cex" xmlns:w16cid="http://schemas.microsoft.com/office/word/2016/wordml/cid" xmlns:w16="http://schemas.microsoft.com/office/word/2018/wordml" xmlns:w16du="http://schemas.microsoft.com/office/word/2023/wordml/word16du" xmlns:w16sdtdh="http://schemas.microsoft.com/office/word/2020/wordml/sdtdatahash" xmlns:w16sdtfl="http://schemas.microsoft.com/office/word/2024/wordml/sdtformatlock" xmlns:w16se="http://schemas.microsoft.com/office/word/2015/wordml/symex" xmlns:wpg="http://schemas.microsoft.com/office/word/2010/wordprocessingGroup" xmlns:wpi="http://schemas.microsoft.com/office/word/2010/wordprocessingInk" xmlns:wne="http://schemas.microsoft.com/office/word/2006/wordml" xmlns:wps="http://schemas.microsoft.com/office/word/2010/wordprocessingShape" mc:Ignorable="w14 w15 w16se w16cid w16 w16cex w16sdtdh w16sdtfl w16du wp14">
+<w:document xmlns:wpc="http://schemas.microsoft.com/office/word/2010/wordprocessingCanvas" xmlns:cx="http://schemas.microsoft.com/office/drawing/2014/chartex" xmlns:cx1="http://schemas.microsoft.com/office/drawing/2015/9/8/chartex" xmlns:cx2="http://schemas.microsoft.com/office/drawing/2015/10/21/chartex" xmlns:cx3="http://schemas.microsoft.com/office/drawing/2016/5/9/chartex" xmlns:cx4="http://schemas.microsoft.com/office/drawing/2016/5/10/chartex" xmlns:cx5="http://schemas.microsoft.com/office/drawing/2016/5/11/chartex" xmlns:cx6="http://schemas.microsoft.com/office/drawing/2016/5/12/chartex" xmlns:cx7="http://schemas.microsoft.com/office/drawing/2016/5/13/chartex" xmlns:cx8="http://schemas.microsoft.com/office/drawing/2016/5/14/chartex" xmlns:mc="http://schemas.openxmlformats.org/markup-compatibility/2006" xmlns:aink="http://schemas.microsoft.com/office/drawing/2016/ink" xmlns:am3d="http://schemas.microsoft.com/office/drawing/2017/model3d" xmlns:o="urn:schemas-microsoft-com:office:office" xmlns:oel="http://schemas.microsoft.com/office/2019/extlst" xmlns:r="http://schemas.openxmlformats.org/officeDocument/2006/relationships" xmlns:m="http://schemas.openxmlformats.org/officeDocument/2006/math" xmlns:v="urn:schemas-microsoft-com:vml" xmlns:wp14="http://schemas.microsoft.com/office/word/2010/wordprocessingDrawing" xmlns:wp="http://schemas.openxmlformats.org/drawingml/2006/wordprocessingDrawing" xmlns:w10="urn:schemas-microsoft-com:office:word" xmlns:w="http://schemas.openxmlformats.org/wordprocessingml/2006/main" xmlns:w14="http://schemas.microsoft.com/office/word/2010/wordml" xmlns:w15="http://schemas.microsoft.com/office/word/2012/wordml" xmlns:w16cei="http://schemas.microsoft.com/office/word/2026/wordml/cei" xmlns:w16cex="http://schemas.microsoft.com/office/word/2018/wordml/cex" xmlns:w16cid="http://schemas.microsoft.com/office/word/2016/wordml/cid" xmlns:w16="http://schemas.microsoft.com/office/word/2018/wordml" xmlns:w16du="http://schemas.microsoft.com/office/word/2023/wordml/word16du" xmlns:w16sdtdh="http://schemas.microsoft.com/office/word/2020/wordml/sdtdatahash" xmlns:w16sdtfl="http://schemas.microsoft.com/office/word/2024/wordml/sdtformatlock" xmlns:w16se="http://schemas.microsoft.com/office/word/2015/wordml/symex" xmlns:wpg="http://schemas.microsoft.com/office/word/2010/wordprocessingGroup" xmlns:wpi="http://schemas.microsoft.com/office/word/2010/wordprocessingInk" xmlns:wne="http://schemas.microsoft.com/office/word/2006/wordml" xmlns:wps="http://schemas.microsoft.com/office/word/2010/wordprocessingShape" mc:Ignorable="w14 w15 w16se w16cid w16 w16cex w16sdtdh w16sdtfl w16du wp14">
   <w:body>
     <w:tbl>
       <w:tblPr>
@@ -78,7 +78,15 @@
     </w:p>
     <w:p>
       <w:r>
-        <w:t>Motivated Computer Science student with a strong foundation in Information Technology, demonstrating a commitment to continuous learning and development. Skilled in cloud computing and network security, with a keen ability to analyse and adapt to business requirements. Eager to apply theoretical knowledge in practical settings, contributing to innovative solutions and enhancing operational efficiency.</w:t>
+        <w:t xml:space="preserve">Motivated Computer Science student with a strong foundation in Information Technology, demonstrating a commitment to continuous learning and development. Skilled in cloud computing and network security, with a keen ability to </w:t>
+      </w:r>
+      <w:proofErr w:type="spellStart"/>
+      <w:r>
+        <w:t>analyse</w:t>
+      </w:r>
+      <w:proofErr w:type="spellEnd"/>
+      <w:r>
+        <w:t xml:space="preserve"> and adapt to business requirements. Eager to apply theoretical knowledge in practical settings, contributing to innovative solutions and enhancing operational efficiency.</w:t>
       </w:r>
     </w:p>
     <w:p>
@@ -105,7 +113,13 @@
         <w:rPr>
           <w:b/>
         </w:rPr>
-        <w:t>Cloud Engineer</w:t>
+        <w:t>Data</w:t>
+      </w:r>
+      <w:r>
+        <w:rPr>
+          <w:b/>
+        </w:rPr>
+        <w:t xml:space="preserve"> Engineer</w:t>
       </w:r>
     </w:p>
     <w:p>
@@ -113,7 +127,10 @@
         <w:spacing w:after="0"/>
       </w:pPr>
       <w:r>
-        <w:t>July 2026 to Current</w:t>
+        <w:t xml:space="preserve">July 2026 to </w:t>
+      </w:r>
+      <w:r>
+        <w:t>Present</w:t>
       </w:r>
     </w:p>
     <w:p>
@@ -143,7 +160,20 @@
         <w:pStyle w:val="ListBullet"/>
       </w:pPr>
       <w:r>
-        <w:t>Analysed business requirements to recommend tailored cloud solutions, leading to improved operational efficiency.</w:t>
+        <w:t>Fixed the database in Google Cloud to maintain consistency.</w:t>
+      </w:r>
+    </w:p>
+    <w:p>
+      <w:pPr>
+        <w:pStyle w:val="ListBullet"/>
+      </w:pPr>
+      <w:proofErr w:type="spellStart"/>
+      <w:r>
+        <w:t>Analysed</w:t>
+      </w:r>
+      <w:proofErr w:type="spellEnd"/>
+      <w:r>
+        <w:t xml:space="preserve"> business requirements to recommend tailored cloud solutions, leading to improved operational efficiency.</w:t>
       </w:r>
     </w:p>
     <w:p>
@@ -167,7 +197,13 @@
         <w:pStyle w:val="ListBullet"/>
       </w:pPr>
       <w:r>
-        <w:t>Leveraged latest network data and industry advancements to uphold optimal security levels.</w:t>
+        <w:t xml:space="preserve">Leveraged </w:t>
+      </w:r>
+      <w:r>
+        <w:t xml:space="preserve">the </w:t>
+      </w:r>
+      <w:r>
+        <w:t>latest network data and industry advancements to uphold optimal security levels.</w:t>
       </w:r>
     </w:p>
     <w:p>
@@ -350,14 +386,26 @@
         <w:rPr>
           <w:b/>
         </w:rPr>
-        <w:t>Bachelor of Science (Honours) : Computer Science</w:t>
+        <w:t>Bachelor of Science (Honours): Computer Science</w:t>
       </w:r>
     </w:p>
     <w:p>
       <w:pPr>
         <w:spacing w:after="0"/>
+        <w:rPr>
+          <w:i/>
+          <w:iCs/>
+          <w:sz w:val="16"/>
+          <w:szCs w:val="16"/>
+        </w:rPr>
       </w:pPr>
       <w:r>
+        <w:rPr>
+          <w:i/>
+          <w:iCs/>
+          <w:sz w:val="16"/>
+          <w:szCs w:val="16"/>
+        </w:rPr>
         <w:t>2025 to Current</w:t>
       </w:r>
     </w:p>
@@ -415,14 +463,26 @@
         <w:rPr>
           <w:b/>
         </w:rPr>
-        <w:t>Foundation in Information Technology : Foundation in Information Technology - Dean</w:t>
+        <w:t>Foundation in Information Technology: Foundation in Information Technology - Dean</w:t>
       </w:r>
     </w:p>
     <w:p>
       <w:pPr>
         <w:spacing w:after="0"/>
+        <w:rPr>
+          <w:i/>
+          <w:iCs/>
+          <w:sz w:val="16"/>
+          <w:szCs w:val="16"/>
+        </w:rPr>
       </w:pPr>
       <w:r>
+        <w:rPr>
+          <w:i/>
+          <w:iCs/>
+          <w:sz w:val="16"/>
+          <w:szCs w:val="16"/>
+        </w:rPr>
         <w:t>2024 to 2025</w:t>
       </w:r>
     </w:p>
@@ -476,16 +536,26 @@
       <w:pPr>
         <w:pStyle w:val="ListBullet"/>
       </w:pPr>
+      <w:proofErr w:type="spellStart"/>
       <w:r>
-        <w:t>HackerRank: Problem Solving certified</w:t>
+        <w:t>HackerRank</w:t>
+      </w:r>
+      <w:proofErr w:type="spellEnd"/>
+      <w:r>
+        <w:t>: Problem Solving certified</w:t>
       </w:r>
     </w:p>
     <w:p>
       <w:pPr>
         <w:pStyle w:val="ListBullet"/>
       </w:pPr>
+      <w:proofErr w:type="spellStart"/>
       <w:r>
-        <w:t>HackerRank: Python certified</w:t>
+        <w:t>HackerRank</w:t>
+      </w:r>
+      <w:proofErr w:type="spellEnd"/>
+      <w:r>
+        <w:t>: Python certified</w:t>
       </w:r>
     </w:p>
     <w:p>
@@ -513,7 +583,31 @@
         <w:t>Tauke.AI</w:t>
       </w:r>
       <w:r>
-        <w:t>: Handle the backend part by using FastAPI, Uvicorn and Supabase. Developing the app for LLM orchestration, ingestion, analysis, and structured processing.</w:t>
+        <w:t xml:space="preserve">: Handle the backend part by using </w:t>
+      </w:r>
+      <w:proofErr w:type="spellStart"/>
+      <w:r>
+        <w:t>FastAPI</w:t>
+      </w:r>
+      <w:proofErr w:type="spellEnd"/>
+      <w:r>
+        <w:t xml:space="preserve">, </w:t>
+      </w:r>
+      <w:proofErr w:type="spellStart"/>
+      <w:r>
+        <w:t>Uvicorn</w:t>
+      </w:r>
+      <w:proofErr w:type="spellEnd"/>
+      <w:r>
+        <w:t xml:space="preserve"> and </w:t>
+      </w:r>
+      <w:proofErr w:type="spellStart"/>
+      <w:r>
+        <w:t>Supabase</w:t>
+      </w:r>
+      <w:proofErr w:type="spellEnd"/>
+      <w:r>
+        <w:t>. Developing the app for LLM orchestration, ingestion, analysis, and structured processing.</w:t>
       </w:r>
     </w:p>
     <w:p>
@@ -524,7 +618,15 @@
         <w:t>AI in Education</w:t>
       </w:r>
       <w:r>
-        <w:t>: Contributed to academic research and writing. Developed the interactive 'Quiz' module and generated multimedia video presentations using Google's NotebookLM.</w:t>
+        <w:t xml:space="preserve">: Contributed to academic research and writing. Developed the interactive 'Quiz' module and generated multimedia video presentations using Google's </w:t>
+      </w:r>
+      <w:proofErr w:type="spellStart"/>
+      <w:r>
+        <w:t>NotebookLM</w:t>
+      </w:r>
+      <w:proofErr w:type="spellEnd"/>
+      <w:r>
+        <w:t>.</w:t>
       </w:r>
     </w:p>
     <w:p>
@@ -637,7 +739,7 @@
 </file>
 
 <file path=word/numbering.xml><?xml version="1.0" encoding="utf-8"?>
-<w:numbering xmlns:wpc="http://schemas.microsoft.com/office/word/2010/wordprocessingCanvas" xmlns:cx="http://schemas.microsoft.com/office/drawing/2014/chartex" xmlns:cx1="http://schemas.microsoft.com/office/drawing/2015/9/8/chartex" xmlns:cx2="http://schemas.microsoft.com/office/drawing/2015/10/21/chartex" xmlns:cx3="http://schemas.microsoft.com/office/drawing/2016/5/9/chartex" xmlns:cx4="http://schemas.microsoft.com/office/drawing/2016/5/10/chartex" xmlns:cx5="http://schemas.microsoft.com/office/drawing/2016/5/11/chartex" xmlns:cx6="http://schemas.microsoft.com/office/drawing/2016/5/12/chartex" xmlns:cx7="http://schemas.microsoft.com/office/drawing/2016/5/13/chartex" xmlns:cx8="http://schemas.microsoft.com/office/drawing/2016/5/14/chartex" xmlns:mc="http://schemas.openxmlformats.org/markup-compatibility/2006" xmlns:aink="http://schemas.microsoft.com/office/drawing/2016/ink" xmlns:am3d="http://schemas.microsoft.com/office/drawing/2017/model3d" xmlns:o="urn:schemas-microsoft-com:office:office" xmlns:oel="http://schemas.microsoft.com/office/2019/extlst" xmlns:r="http://schemas.openxmlformats.org/officeDocument/2006/relationships" xmlns:m="http://schemas.openxmlformats.org/officeDocument/2006/math" xmlns:v="urn:schemas-microsoft-com:vml" xmlns:wp14="http://schemas.microsoft.com/office/word/2010/wordprocessingDrawing" xmlns:wp="http://schemas.openxmlformats.org/drawingml/2006/wordprocessingDrawing" xmlns:w10="urn:schemas-microsoft-com:office:word" xmlns:w="http://schemas.openxmlformats.org/wordprocessingml/2006/main" xmlns:w14="http://schemas.microsoft.com/office/word/2010/wordml" xmlns:w15="http://schemas.microsoft.com/office/word/2012/wordml" xmlns:w16cex="http://schemas.microsoft.com/office/word/2018/wordml/cex" xmlns:w16cid="http://schemas.microsoft.com/office/word/2016/wordml/cid" xmlns:w16="http://schemas.microsoft.com/office/word/2018/wordml" xmlns:w16du="http://schemas.microsoft.com/office/word/2023/wordml/word16du" xmlns:w16sdtdh="http://schemas.microsoft.com/office/word/2020/wordml/sdtdatahash" xmlns:w16sdtfl="http://schemas.microsoft.com/office/word/2024/wordml/sdtformatlock" xmlns:w16se="http://schemas.microsoft.com/office/word/2015/wordml/symex" xmlns:wpg="http://schemas.microsoft.com/office/word/2010/wordprocessingGroup" xmlns:wpi="http://schemas.microsoft.com/office/word/2010/wordprocessingInk" xmlns:wne="http://schemas.microsoft.com/office/word/2006/wordml" xmlns:wps="http://schemas.microsoft.com/office/word/2010/wordprocessingShape" mc:Ignorable="w14 w15 w16se w16cid w16 w16cex w16sdtdh w16sdtfl w16du wp14">
+<w:numbering xmlns:wpc="http://schemas.microsoft.com/office/word/2010/wordprocessingCanvas" xmlns:cx="http://schemas.microsoft.com/office/drawing/2014/chartex" xmlns:cx1="http://schemas.microsoft.com/office/drawing/2015/9/8/chartex" xmlns:cx2="http://schemas.microsoft.com/office/drawing/2015/10/21/chartex" xmlns:cx3="http://schemas.microsoft.com/office/drawing/2016/5/9/chartex" xmlns:cx4="http://schemas.microsoft.com/office/drawing/2016/5/10/chartex" xmlns:cx5="http://schemas.microsoft.com/office/drawing/2016/5/11/chartex" xmlns:cx6="http://schemas.microsoft.com/office/drawing/2016/5/12/chartex" xmlns:cx7="http://schemas.microsoft.com/office/drawing/2016/5/13/chartex" xmlns:cx8="http://schemas.microsoft.com/office/drawing/2016/5/14/chartex" xmlns:mc="http://schemas.openxmlformats.org/markup-compatibility/2006" xmlns:aink="http://schemas.microsoft.com/office/drawing/2016/ink" xmlns:am3d="http://schemas.microsoft.com/office/drawing/2017/model3d" xmlns:o="urn:schemas-microsoft-com:office:office" xmlns:oel="http://schemas.microsoft.com/office/2019/extlst" xmlns:r="http://schemas.openxmlformats.org/officeDocument/2006/relationships" xmlns:m="http://schemas.openxmlformats.org/officeDocument/2006/math" xmlns:v="urn:schemas-microsoft-com:vml" xmlns:wp14="http://schemas.microsoft.com/office/word/2010/wordprocessingDrawing" xmlns:wp="http://schemas.openxmlformats.org/drawingml/2006/wordprocessingDrawing" xmlns:w10="urn:schemas-microsoft-com:office:word" xmlns:w="http://schemas.openxmlformats.org/wordprocessingml/2006/main" xmlns:w14="http://schemas.microsoft.com/office/word/2010/wordml" xmlns:w15="http://schemas.microsoft.com/office/word/2012/wordml" xmlns:w16cei="http://schemas.microsoft.com/office/word/2026/wordml/cei" xmlns:w16cex="http://schemas.microsoft.com/office/word/2018/wordml/cex" xmlns:w16cid="http://schemas.microsoft.com/office/word/2016/wordml/cid" xmlns:w16="http://schemas.microsoft.com/office/word/2018/wordml" xmlns:w16du="http://schemas.microsoft.com/office/word/2023/wordml/word16du" xmlns:w16sdtdh="http://schemas.microsoft.com/office/word/2020/wordml/sdtdatahash" xmlns:w16sdtfl="http://schemas.microsoft.com/office/word/2024/wordml/sdtformatlock" xmlns:w16se="http://schemas.microsoft.com/office/word/2015/wordml/symex" xmlns:wpg="http://schemas.microsoft.com/office/word/2010/wordprocessingGroup" xmlns:wpi="http://schemas.microsoft.com/office/word/2010/wordprocessingInk" xmlns:wne="http://schemas.microsoft.com/office/word/2006/wordml" xmlns:wps="http://schemas.microsoft.com/office/word/2010/wordprocessingShape" mc:Ignorable="w14 w15 w16se w16cid w16 w16cex w16sdtdh w16sdtfl w16du wp14">
   <w:abstractNum w:abstractNumId="0" w15:restartNumberingAfterBreak="0">
     <w:nsid w:val="FFFFFF7C"/>
     <w:multiLevelType w:val="singleLevel"/>

</xml_diff>